<commit_message>
Canvis en el pdf 1.A
</commit_message>
<xml_diff>
--- a/docs/Entrega_1A_SaforPista.docx
+++ b/docs/Entrega_1A_SaforPista.docx
@@ -4587,31 +4587,41 @@
         </w:rPr>
         <w:t xml:space="preserve">Enllaç: </w:t>
       </w:r>
-      <w:r>
-        <w:rPr>
-          <w:color w:val="1B4F8A"/>
-        </w:rPr>
-        <w:t>https://github.com/</w:t>
-      </w:r>
-      <w:r>
-        <w:rPr>
-          <w:color w:val="1B4F8A"/>
-        </w:rPr>
-        <w:t>mariaescrivaorengo-web</w:t>
-      </w:r>
-      <w:r>
-        <w:rPr>
-          <w:color w:val="1B4F8A"/>
-        </w:rPr>
-        <w:t>/saforpista</w:t>
-      </w:r>
+      <w:hyperlink r:id="rId8" w:history="1">
+        <w:r>
+          <w:rPr>
+            <w:rStyle w:val="Hipervnculo"/>
+          </w:rPr>
+          <w:t>https://github.com/</w:t>
+        </w:r>
+        <w:r>
+          <w:rPr>
+            <w:rStyle w:val="Hipervnculo"/>
+          </w:rPr>
+          <w:t>mariaescrivaorengo-web</w:t>
+        </w:r>
+        <w:r>
+          <w:rPr>
+            <w:rStyle w:val="Hipervnculo"/>
+          </w:rPr>
+          <w:t>/saforpista</w:t>
+        </w:r>
+        <w:r>
+          <w:rPr>
+            <w:rStyle w:val="Hipervnculo"/>
+            <w:i/>
+            <w:iCs/>
+          </w:rPr>
+          <w:t xml:space="preserve"> </w:t>
+        </w:r>
+      </w:hyperlink>
       <w:r>
         <w:rPr>
           <w:i/>
           <w:iCs/>
           <w:color w:val="C8572B"/>
         </w:rPr>
-        <w:t xml:space="preserve">  </w:t>
+        <w:t xml:space="preserve"> </w:t>
       </w:r>
     </w:p>
     <w:p>
@@ -5019,7 +5029,7 @@
                     <pic:cNvPicPr/>
                   </pic:nvPicPr>
                   <pic:blipFill>
-                    <a:blip r:embed="rId8">
+                    <a:blip r:embed="rId9">
                       <a:extLst>
                         <a:ext uri="{28A0092B-C50C-407E-A947-70E740481C1C}">
                           <a14:useLocalDpi xmlns:a14="http://schemas.microsoft.com/office/drawing/2010/main" val="0"/>
@@ -5109,7 +5119,7 @@
                     <pic:cNvPicPr/>
                   </pic:nvPicPr>
                   <pic:blipFill>
-                    <a:blip r:embed="rId9" cstate="print">
+                    <a:blip r:embed="rId10" cstate="print">
                       <a:extLst>
                         <a:ext uri="{28A0092B-C50C-407E-A947-70E740481C1C}">
                           <a14:useLocalDpi xmlns:a14="http://schemas.microsoft.com/office/drawing/2010/main" val="0"/>
@@ -7533,7 +7543,7 @@
       <w:r>
         <w:t xml:space="preserve">Federació Internacional de Pàdel (2025). </w:t>
       </w:r>
-      <w:hyperlink r:id="rId10" w:history="1">
+      <w:hyperlink r:id="rId11" w:history="1">
         <w:r>
           <w:rPr>
             <w:rStyle w:val="Hipervnculo"/>
@@ -7554,8 +7564,8 @@
       </w:pPr>
     </w:p>
     <w:sectPr>
-      <w:headerReference w:type="default" r:id="rId11"/>
-      <w:footerReference w:type="default" r:id="rId12"/>
+      <w:headerReference w:type="default" r:id="rId12"/>
+      <w:footerReference w:type="default" r:id="rId13"/>
       <w:pgSz w:w="11906" w:h="16838"/>
       <w:pgMar w:top="1134" w:right="1134" w:bottom="1134" w:left="1134" w:header="708" w:footer="708" w:gutter="0"/>
       <w:cols w:space="720"/>
@@ -8380,6 +8390,7 @@
   <w:style w:type="character" w:default="1" w:styleId="Fuentedeprrafopredeter">
     <w:name w:val="Default Paragraph Font"/>
     <w:uiPriority w:val="1"/>
+    <w:semiHidden/>
     <w:unhideWhenUsed/>
   </w:style>
   <w:style w:type="table" w:default="1" w:styleId="Tablanormal">
@@ -8523,6 +8534,18 @@
     <w:rPr>
       <w:b/>
       <w:bCs/>
+    </w:rPr>
+  </w:style>
+  <w:style w:type="character" w:styleId="Mencinsinresolver">
+    <w:name w:val="Unresolved Mention"/>
+    <w:basedOn w:val="Fuentedeprrafopredeter"/>
+    <w:uiPriority w:val="99"/>
+    <w:semiHidden/>
+    <w:unhideWhenUsed/>
+    <w:rsid w:val="00164802"/>
+    <w:rPr>
+      <w:color w:val="605E5C"/>
+      <w:shd w:val="clear" w:color="auto" w:fill="E1DFDD"/>
     </w:rPr>
   </w:style>
 </w:styles>

</xml_diff>